<commit_message>
Expand equipment failure act text fields
</commit_message>
<xml_diff>
--- a/Templates/Acts/equipment_failure_act.docx
+++ b/Templates/Acts/equipment_failure_act.docx
@@ -7,47 +7,38 @@
         <w:pStyle w:val="a3"/>
         <w:rPr>
           <w:rFonts w:ascii="Arial" w:hAnsi="Arial"/>
-          <w:sz w:val="36"/>
-        </w:rPr>
-      </w:pPr>
-      <w:bookmarkStart w:id="0" w:name="_GoBack"/>
-      <w:bookmarkEnd w:id="0"/>
-      <w:r>
+          <w:szCs w:val="24"/>
+        </w:rPr>
+      </w:pPr>
+      <w:r>
+        <w:rPr>
+          <w:rFonts w:ascii="Arial" w:hAnsi="Arial"/>
+          <w:szCs w:val="24"/>
+        </w:rPr>
+        <w:t>А</w:t>
+      </w:r>
+      <w:r>
+        <w:rPr>
+          <w:rFonts w:ascii="Arial" w:hAnsi="Arial"/>
+          <w:szCs w:val="24"/>
+        </w:rPr>
+        <w:t xml:space="preserve">кт выхода из строя </w:t>
+      </w:r>
+      <w:r>
+        <w:rPr>
+          <w:rFonts w:ascii="Arial" w:hAnsi="Arial"/>
+          <w:szCs w:val="24"/>
+        </w:rPr>
+        <w:t>электрооборудования</w:t>
+      </w:r>
+    </w:p>
+    <w:p>
+      <w:pPr>
+        <w:pStyle w:val="a3"/>
         <w:rPr>
           <w:rFonts w:ascii="Arial" w:hAnsi="Arial"/>
           <w:sz w:val="36"/>
         </w:rPr>
-        <w:t>А</w:t>
-      </w:r>
-      <w:r>
-        <w:rPr>
-          <w:rFonts w:ascii="Arial" w:hAnsi="Arial"/>
-          <w:sz w:val="36"/>
-        </w:rPr>
-        <w:t>кт</w:t>
-      </w:r>
-      <w:r>
-        <w:rPr>
-          <w:rFonts w:ascii="Arial" w:hAnsi="Arial"/>
-          <w:sz w:val="36"/>
-        </w:rPr>
-        <w:tab/>
-      </w:r>
-      <w:r>
-        <w:rPr>
-          <w:rFonts w:ascii="Arial" w:hAnsi="Arial"/>
-          <w:sz w:val="36"/>
-        </w:rPr>
-        <w:t>выхода из строя электрооборудования</w:t>
-      </w:r>
-    </w:p>
-    <w:p>
-      <w:pPr>
-        <w:pStyle w:val="a3"/>
-        <w:rPr>
-          <w:rFonts w:ascii="Arial" w:hAnsi="Arial"/>
-          <w:sz w:val="36"/>
-        </w:rPr>
       </w:pPr>
     </w:p>
     <w:p>
@@ -57,15 +48,18 @@
         <w:rPr>
           <w:rFonts w:ascii="Arial" w:hAnsi="Arial" w:cs="Arial"/>
           <w:b w:val="0"/>
-          <w:sz w:val="36"/>
-        </w:rPr>
-      </w:pPr>
-      <w:r>
-        <w:rPr>
-          <w:rFonts w:ascii="Arial" w:hAnsi="Arial" w:cs="Arial"/>
-          <w:sz w:val="20"/>
-        </w:rPr>
-        <w:t xml:space="preserve">№ акта _________     Дата {{ActDate}} г.</w:t>
+          <w:sz w:val="22"/>
+          <w:szCs w:val="22"/>
+        </w:rPr>
+      </w:pPr>
+      <w:r>
+        <w:rPr>
+          <w:rFonts w:ascii="Arial" w:hAnsi="Arial" w:cs="Arial"/>
+          <w:b w:val="0"/>
+          <w:sz w:val="22"/>
+          <w:szCs w:val="22"/>
+        </w:rPr>
+        <w:t>№ акта _________     Дата {{ActDate}} г.</w:t>
       </w:r>
     </w:p>
     <w:p>
@@ -89,14 +83,16 @@
         <w:rPr>
           <w:rFonts w:ascii="Arial" w:hAnsi="Arial" w:cs="Arial"/>
           <w:b w:val="0"/>
-          <w:sz w:val="20"/>
-        </w:rPr>
-      </w:pPr>
-      <w:r>
-        <w:rPr>
-          <w:rFonts w:ascii="Arial" w:hAnsi="Arial" w:cs="Arial"/>
-          <w:b w:val="0"/>
-          <w:sz w:val="20"/>
+          <w:sz w:val="22"/>
+          <w:szCs w:val="22"/>
+        </w:rPr>
+      </w:pPr>
+      <w:r>
+        <w:rPr>
+          <w:rFonts w:ascii="Arial" w:hAnsi="Arial" w:cs="Arial"/>
+          <w:b w:val="0"/>
+          <w:sz w:val="22"/>
+          <w:szCs w:val="22"/>
         </w:rPr>
         <w:t>АО «Уралэлектромедь», 624091 Россия, Свердловская область,</w:t>
       </w:r>
@@ -108,13 +104,16 @@
         <w:rPr>
           <w:rFonts w:ascii="Arial" w:hAnsi="Arial" w:cs="Arial"/>
           <w:b w:val="0"/>
-        </w:rPr>
-      </w:pPr>
-      <w:r>
-        <w:rPr>
-          <w:rFonts w:ascii="Arial" w:hAnsi="Arial" w:cs="Arial"/>
-          <w:b w:val="0"/>
-          <w:sz w:val="20"/>
+          <w:sz w:val="22"/>
+          <w:szCs w:val="22"/>
+        </w:rPr>
+      </w:pPr>
+      <w:r>
+        <w:rPr>
+          <w:rFonts w:ascii="Arial" w:hAnsi="Arial" w:cs="Arial"/>
+          <w:b w:val="0"/>
+          <w:sz w:val="22"/>
+          <w:szCs w:val="22"/>
         </w:rPr>
         <w:t xml:space="preserve"> г. Верхняя Пышма, </w:t>
       </w:r>
@@ -122,7 +121,8 @@
         <w:rPr>
           <w:rFonts w:ascii="Arial" w:hAnsi="Arial" w:cs="Arial"/>
           <w:b w:val="0"/>
-          <w:sz w:val="20"/>
+          <w:sz w:val="22"/>
+          <w:szCs w:val="22"/>
         </w:rPr>
         <w:t>пр-т Успенский</w:t>
       </w:r>
@@ -130,23 +130,53 @@
         <w:rPr>
           <w:rFonts w:ascii="Arial" w:hAnsi="Arial" w:cs="Arial"/>
           <w:b w:val="0"/>
-          <w:sz w:val="20"/>
-        </w:rPr>
-        <w:t>, тел</w:t>
-      </w:r>
-      <w:r>
-        <w:rPr>
-          <w:rFonts w:ascii="Arial" w:hAnsi="Arial" w:cs="Arial"/>
-          <w:b w:val="0"/>
-          <w:sz w:val="20"/>
-        </w:rPr>
-        <w:t>(343) 379-40-71, (34368) 4-61-21</w:t>
-      </w:r>
-      <w:r>
-        <w:rPr>
-          <w:rFonts w:ascii="Arial" w:hAnsi="Arial" w:cs="Arial"/>
-          <w:b w:val="0"/>
-          <w:sz w:val="20"/>
+          <w:sz w:val="22"/>
+          <w:szCs w:val="22"/>
+        </w:rPr>
+        <w:t xml:space="preserve">, </w:t>
+      </w:r>
+      <w:r>
+        <w:rPr>
+          <w:rFonts w:ascii="Arial" w:hAnsi="Arial" w:cs="Arial"/>
+          <w:b w:val="0"/>
+          <w:sz w:val="22"/>
+          <w:szCs w:val="22"/>
+        </w:rPr>
+        <w:t>тел</w:t>
+      </w:r>
+      <w:r>
+        <w:rPr>
+          <w:rFonts w:ascii="Arial" w:hAnsi="Arial" w:cs="Arial"/>
+          <w:b w:val="0"/>
+          <w:sz w:val="22"/>
+          <w:szCs w:val="22"/>
+        </w:rPr>
+        <w:t>.</w:t>
+      </w:r>
+      <w:r>
+        <w:rPr>
+          <w:rFonts w:ascii="Arial" w:hAnsi="Arial" w:cs="Arial"/>
+          <w:b w:val="0"/>
+          <w:sz w:val="22"/>
+          <w:szCs w:val="22"/>
+        </w:rPr>
+        <w:t xml:space="preserve"> (</w:t>
+      </w:r>
+      <w:r>
+        <w:rPr>
+          <w:rFonts w:ascii="Arial" w:hAnsi="Arial" w:cs="Arial"/>
+          <w:b w:val="0"/>
+          <w:sz w:val="22"/>
+          <w:szCs w:val="22"/>
+        </w:rPr>
+        <w:t>343) 379-40-71, (34368) 4-61-21</w:t>
+      </w:r>
+      <w:r>
+        <w:rPr>
+          <w:rFonts w:ascii="Arial" w:hAnsi="Arial" w:cs="Arial"/>
+          <w:b w:val="0"/>
+          <w:sz w:val="22"/>
+          <w:szCs w:val="22"/>
         </w:rPr>
         <w:t>, 65-90-73,</w:t>
       </w:r>
@@ -156,18 +186,24 @@
         <w:ind w:firstLine="360"/>
         <w:rPr>
           <w:rFonts w:ascii="Arial" w:hAnsi="Arial" w:cs="Arial"/>
+          <w:sz w:val="22"/>
+          <w:szCs w:val="22"/>
           <w:lang w:val="en-US"/>
         </w:rPr>
       </w:pPr>
       <w:r>
         <w:rPr>
           <w:rFonts w:ascii="Arial" w:hAnsi="Arial" w:cs="Arial"/>
+          <w:sz w:val="22"/>
+          <w:szCs w:val="22"/>
         </w:rPr>
         <w:t>факс</w:t>
       </w:r>
       <w:r>
         <w:rPr>
           <w:rFonts w:ascii="Arial" w:hAnsi="Arial" w:cs="Arial"/>
+          <w:sz w:val="22"/>
+          <w:szCs w:val="22"/>
           <w:lang w:val="en-US"/>
         </w:rPr>
         <w:t xml:space="preserve"> </w:t>
@@ -175,12 +211,16 @@
       <w:r>
         <w:rPr>
           <w:rFonts w:ascii="Arial" w:hAnsi="Arial" w:cs="Arial"/>
+          <w:sz w:val="22"/>
+          <w:szCs w:val="22"/>
         </w:rPr>
         <w:t>(343) 379-40-70, (34368) 4-26-26</w:t>
       </w:r>
       <w:r>
         <w:rPr>
           <w:rFonts w:ascii="Arial" w:hAnsi="Arial" w:cs="Arial"/>
+          <w:sz w:val="22"/>
+          <w:szCs w:val="22"/>
           <w:lang w:val="en-US"/>
         </w:rPr>
         <w:t xml:space="preserve">, </w:t>
@@ -191,12 +231,16 @@
         <w:ind w:firstLine="360"/>
         <w:rPr>
           <w:rFonts w:ascii="Arial" w:hAnsi="Arial" w:cs="Arial"/>
+          <w:sz w:val="22"/>
+          <w:szCs w:val="22"/>
           <w:lang w:val="en-US"/>
         </w:rPr>
       </w:pPr>
       <w:r>
         <w:rPr>
           <w:rFonts w:ascii="Arial" w:hAnsi="Arial" w:cs="Arial"/>
+          <w:sz w:val="22"/>
+          <w:szCs w:val="22"/>
           <w:lang w:val="en-US"/>
         </w:rPr>
         <w:t>e-mail: aouralem@elem.ru        http: //www.elem.ru</w:t>
@@ -211,7 +255,6 @@
           <w:b w:val="0"/>
           <w:sz w:val="6"/>
           <w:szCs w:val="6"/>
-          <w:lang w:val="en-US"/>
         </w:rPr>
       </w:pPr>
       <w:r>
@@ -230,14 +273,16 @@
         <w:rPr>
           <w:rFonts w:ascii="Arial" w:hAnsi="Arial" w:cs="Arial"/>
           <w:b w:val="0"/>
-          <w:sz w:val="20"/>
-        </w:rPr>
-      </w:pPr>
-      <w:r>
-        <w:rPr>
-          <w:rFonts w:ascii="Arial" w:hAnsi="Arial" w:cs="Arial"/>
-          <w:b w:val="0"/>
-          <w:sz w:val="20"/>
+          <w:sz w:val="18"/>
+          <w:szCs w:val="18"/>
+        </w:rPr>
+      </w:pPr>
+      <w:r>
+        <w:rPr>
+          <w:rFonts w:ascii="Arial" w:hAnsi="Arial" w:cs="Arial"/>
+          <w:b w:val="0"/>
+          <w:sz w:val="18"/>
+          <w:szCs w:val="18"/>
         </w:rPr>
         <w:t xml:space="preserve">        (Полное наименование компании с указанием юридического и фактического адреса)</w:t>
       </w:r>
@@ -263,16 +308,47 @@
         <w:rPr>
           <w:rFonts w:ascii="Arial" w:hAnsi="Arial" w:cs="Arial"/>
           <w:b w:val="0"/>
-          <w:sz w:val="20"/>
-        </w:rPr>
-      </w:pPr>
-      <w:r>
-        <w:rPr>
-          <w:rFonts w:ascii="Arial" w:hAnsi="Arial" w:cs="Arial"/>
-          <w:b w:val="0"/>
-          <w:sz w:val="20"/>
-        </w:rPr>
-        <w:t xml:space="preserve">{{InstallationPlace}}</w:t>
+          <w:sz w:val="22"/>
+          <w:szCs w:val="22"/>
+        </w:rPr>
+      </w:pPr>
+      <w:r>
+        <w:rPr>
+          <w:rFonts w:ascii="Arial" w:hAnsi="Arial" w:cs="Arial"/>
+          <w:b w:val="0"/>
+          <w:sz w:val="22"/>
+          <w:szCs w:val="22"/>
+        </w:rPr>
+        <w:t xml:space="preserve"> </w:t>
+      </w:r>
+      <w:r>
+        <w:rPr>
+          <w:rFonts w:ascii="Arial" w:hAnsi="Arial" w:cs="Arial"/>
+          <w:b w:val="0"/>
+          <w:sz w:val="22"/>
+          <w:szCs w:val="22"/>
+        </w:rPr>
+        <w:t>{{</w:t>
+      </w:r>
+      <w:proofErr w:type="spellStart"/>
+      <w:r>
+        <w:rPr>
+          <w:rFonts w:ascii="Arial" w:hAnsi="Arial" w:cs="Arial"/>
+          <w:b w:val="0"/>
+          <w:sz w:val="22"/>
+          <w:szCs w:val="22"/>
+        </w:rPr>
+        <w:t>InstallationPlace</w:t>
+      </w:r>
+      <w:proofErr w:type="spellEnd"/>
+      <w:r>
+        <w:rPr>
+          <w:rFonts w:ascii="Arial" w:hAnsi="Arial" w:cs="Arial"/>
+          <w:b w:val="0"/>
+          <w:sz w:val="22"/>
+          <w:szCs w:val="22"/>
+        </w:rPr>
+        <w:t>}}</w:t>
       </w:r>
     </w:p>
     <w:p>
@@ -304,14 +380,16 @@
         <w:rPr>
           <w:rFonts w:ascii="Arial" w:hAnsi="Arial" w:cs="Arial"/>
           <w:b w:val="0"/>
-          <w:sz w:val="20"/>
-        </w:rPr>
-      </w:pPr>
-      <w:r>
-        <w:rPr>
-          <w:rFonts w:ascii="Arial" w:hAnsi="Arial" w:cs="Arial"/>
-          <w:b w:val="0"/>
-          <w:sz w:val="20"/>
+          <w:sz w:val="18"/>
+          <w:szCs w:val="18"/>
+        </w:rPr>
+      </w:pPr>
+      <w:r>
+        <w:rPr>
+          <w:rFonts w:ascii="Arial" w:hAnsi="Arial" w:cs="Arial"/>
+          <w:b w:val="0"/>
+          <w:sz w:val="18"/>
+          <w:szCs w:val="18"/>
         </w:rPr>
         <w:t>(</w:t>
       </w:r>
@@ -319,7 +397,8 @@
         <w:rPr>
           <w:rFonts w:ascii="Arial" w:hAnsi="Arial" w:cs="Arial"/>
           <w:b w:val="0"/>
-          <w:sz w:val="20"/>
+          <w:sz w:val="18"/>
+          <w:szCs w:val="18"/>
         </w:rPr>
         <w:t>Место установки</w:t>
       </w:r>
@@ -327,7 +406,8 @@
         <w:rPr>
           <w:rFonts w:ascii="Arial" w:hAnsi="Arial" w:cs="Arial"/>
           <w:b w:val="0"/>
-          <w:sz w:val="20"/>
+          <w:sz w:val="18"/>
+          <w:szCs w:val="18"/>
         </w:rPr>
         <w:t xml:space="preserve"> </w:t>
       </w:r>
@@ -335,7 +415,8 @@
         <w:rPr>
           <w:rFonts w:ascii="Arial" w:hAnsi="Arial" w:cs="Arial"/>
           <w:b w:val="0"/>
-          <w:sz w:val="20"/>
+          <w:sz w:val="18"/>
+          <w:szCs w:val="18"/>
         </w:rPr>
         <w:t>(цех, система)</w:t>
       </w:r>
@@ -343,7 +424,8 @@
         <w:rPr>
           <w:rFonts w:ascii="Arial" w:hAnsi="Arial" w:cs="Arial"/>
           <w:b w:val="0"/>
-          <w:sz w:val="20"/>
+          <w:sz w:val="18"/>
+          <w:szCs w:val="18"/>
         </w:rPr>
         <w:t>)</w:t>
       </w:r>
@@ -351,7 +433,8 @@
         <w:rPr>
           <w:rFonts w:ascii="Arial" w:hAnsi="Arial" w:cs="Arial"/>
           <w:b w:val="0"/>
-          <w:sz w:val="20"/>
+          <w:sz w:val="18"/>
+          <w:szCs w:val="18"/>
         </w:rPr>
         <w:t xml:space="preserve"> </w:t>
       </w:r>
@@ -363,7 +446,8 @@
         <w:rPr>
           <w:rFonts w:ascii="Arial" w:hAnsi="Arial" w:cs="Arial"/>
           <w:b w:val="0"/>
-          <w:sz w:val="20"/>
+          <w:sz w:val="22"/>
+          <w:szCs w:val="22"/>
         </w:rPr>
       </w:pPr>
     </w:p>
@@ -377,7 +461,8 @@
         <w:rPr>
           <w:rFonts w:ascii="Arial" w:hAnsi="Arial" w:cs="Arial"/>
           <w:b w:val="0"/>
-          <w:sz w:val="20"/>
+          <w:sz w:val="22"/>
+          <w:szCs w:val="22"/>
           <w:lang w:val="en-US"/>
         </w:rPr>
       </w:pPr>
@@ -385,10 +470,42 @@
         <w:rPr>
           <w:rFonts w:ascii="Arial" w:hAnsi="Arial" w:cs="Arial"/>
           <w:b w:val="0"/>
-          <w:sz w:val="20"/>
+          <w:sz w:val="22"/>
+          <w:szCs w:val="22"/>
+        </w:rPr>
+        <w:t xml:space="preserve"> </w:t>
+      </w:r>
+      <w:r>
+        <w:rPr>
+          <w:rFonts w:ascii="Arial" w:hAnsi="Arial" w:cs="Arial"/>
+          <w:b w:val="0"/>
+          <w:sz w:val="22"/>
+          <w:szCs w:val="22"/>
           <w:lang w:val="en-US"/>
         </w:rPr>
-        <w:t xml:space="preserve">{{EquipmentName}}</w:t>
+        <w:t>{{</w:t>
+      </w:r>
+      <w:proofErr w:type="spellStart"/>
+      <w:r>
+        <w:rPr>
+          <w:rFonts w:ascii="Arial" w:hAnsi="Arial" w:cs="Arial"/>
+          <w:b w:val="0"/>
+          <w:sz w:val="22"/>
+          <w:szCs w:val="22"/>
+          <w:lang w:val="en-US"/>
+        </w:rPr>
+        <w:t>EquipmentName</w:t>
+      </w:r>
+      <w:proofErr w:type="spellEnd"/>
+      <w:r>
+        <w:rPr>
+          <w:rFonts w:ascii="Arial" w:hAnsi="Arial" w:cs="Arial"/>
+          <w:b w:val="0"/>
+          <w:sz w:val="22"/>
+          <w:szCs w:val="22"/>
+          <w:lang w:val="en-US"/>
+        </w:rPr>
+        <w:t>}}</w:t>
       </w:r>
     </w:p>
     <w:p>
@@ -438,14 +555,16 @@
         <w:rPr>
           <w:rFonts w:ascii="Arial" w:hAnsi="Arial" w:cs="Arial"/>
           <w:b w:val="0"/>
-          <w:sz w:val="20"/>
-        </w:rPr>
-      </w:pPr>
-      <w:r>
-        <w:rPr>
-          <w:rFonts w:ascii="Arial" w:hAnsi="Arial" w:cs="Arial"/>
-          <w:b w:val="0"/>
-          <w:sz w:val="20"/>
+          <w:sz w:val="18"/>
+          <w:szCs w:val="18"/>
+        </w:rPr>
+      </w:pPr>
+      <w:r>
+        <w:rPr>
+          <w:rFonts w:ascii="Arial" w:hAnsi="Arial" w:cs="Arial"/>
+          <w:b w:val="0"/>
+          <w:sz w:val="18"/>
+          <w:szCs w:val="18"/>
         </w:rPr>
         <w:t>(Тип оборудования/детали</w:t>
       </w:r>
@@ -453,9 +572,10 @@
         <w:rPr>
           <w:rFonts w:ascii="Arial" w:hAnsi="Arial" w:cs="Arial"/>
           <w:b w:val="0"/>
-          <w:sz w:val="20"/>
-        </w:rPr>
-        <w:t>.)</w:t>
+          <w:sz w:val="18"/>
+          <w:szCs w:val="18"/>
+        </w:rPr>
+        <w:t>)</w:t>
       </w:r>
     </w:p>
     <w:p>
@@ -478,6 +598,57 @@
         <w:rPr>
           <w:rFonts w:ascii="Arial" w:hAnsi="Arial" w:cs="Arial"/>
           <w:b w:val="0"/>
+          <w:sz w:val="22"/>
+          <w:szCs w:val="22"/>
+          <w:lang w:val="en-US"/>
+        </w:rPr>
+      </w:pPr>
+      <w:r>
+        <w:rPr>
+          <w:rFonts w:ascii="Arial" w:hAnsi="Arial" w:cs="Arial"/>
+          <w:b w:val="0"/>
+          <w:sz w:val="22"/>
+          <w:szCs w:val="22"/>
+        </w:rPr>
+        <w:t xml:space="preserve"> </w:t>
+      </w:r>
+      <w:r>
+        <w:rPr>
+          <w:rFonts w:ascii="Arial" w:hAnsi="Arial" w:cs="Arial"/>
+          <w:b w:val="0"/>
+          <w:sz w:val="22"/>
+          <w:szCs w:val="22"/>
+        </w:rPr>
+        <w:t>{{</w:t>
+      </w:r>
+      <w:proofErr w:type="spellStart"/>
+      <w:r>
+        <w:rPr>
+          <w:rFonts w:ascii="Arial" w:hAnsi="Arial" w:cs="Arial"/>
+          <w:b w:val="0"/>
+          <w:sz w:val="22"/>
+          <w:szCs w:val="22"/>
+        </w:rPr>
+        <w:t>OrderNumber</w:t>
+      </w:r>
+      <w:proofErr w:type="spellEnd"/>
+      <w:r>
+        <w:rPr>
+          <w:rFonts w:ascii="Arial" w:hAnsi="Arial" w:cs="Arial"/>
+          <w:b w:val="0"/>
+          <w:sz w:val="22"/>
+          <w:szCs w:val="22"/>
+        </w:rPr>
+        <w:t>}}</w:t>
+      </w:r>
+    </w:p>
+    <w:p>
+      <w:pPr>
+        <w:pStyle w:val="a4"/>
+        <w:ind w:firstLine="357"/>
+        <w:rPr>
+          <w:rFonts w:ascii="Arial" w:hAnsi="Arial" w:cs="Arial"/>
+          <w:b w:val="0"/>
           <w:sz w:val="6"/>
           <w:szCs w:val="6"/>
           <w:lang w:val="en-US"/>
@@ -487,29 +658,8 @@
         <w:rPr>
           <w:rFonts w:ascii="Arial" w:hAnsi="Arial" w:cs="Arial"/>
           <w:b w:val="0"/>
-          <w:sz w:val="20"/>
-        </w:rPr>
-        <w:t xml:space="preserve">{{OrderNumber}}</w:t>
-      </w:r>
-    </w:p>
-    <w:p>
-      <w:pPr>
-        <w:pStyle w:val="a4"/>
-        <w:ind w:firstLine="357"/>
-        <w:rPr>
-          <w:rFonts w:ascii="Arial" w:hAnsi="Arial" w:cs="Arial"/>
-          <w:b w:val="0"/>
           <w:sz w:val="6"/>
           <w:szCs w:val="6"/>
-          <w:lang w:val="en-US"/>
-        </w:rPr>
-      </w:pPr>
-      <w:r>
-        <w:rPr>
-          <w:rFonts w:ascii="Arial" w:hAnsi="Arial" w:cs="Arial"/>
-          <w:b w:val="0"/>
-          <w:sz w:val="6"/>
-          <w:szCs w:val="6"/>
         </w:rPr>
         <w:t>__________________________________________________________________________________________________________________________________________________________________________________________________________________________________________________________</w:t>
       </w:r>
@@ -521,14 +671,16 @@
         <w:rPr>
           <w:rFonts w:ascii="Arial" w:hAnsi="Arial" w:cs="Arial"/>
           <w:b w:val="0"/>
-          <w:sz w:val="20"/>
-        </w:rPr>
-      </w:pPr>
-      <w:r>
-        <w:rPr>
-          <w:rFonts w:ascii="Arial" w:hAnsi="Arial" w:cs="Arial"/>
-          <w:b w:val="0"/>
-          <w:sz w:val="20"/>
+          <w:sz w:val="18"/>
+          <w:szCs w:val="18"/>
+        </w:rPr>
+      </w:pPr>
+      <w:r>
+        <w:rPr>
+          <w:rFonts w:ascii="Arial" w:hAnsi="Arial" w:cs="Arial"/>
+          <w:b w:val="0"/>
+          <w:sz w:val="18"/>
+          <w:szCs w:val="18"/>
         </w:rPr>
         <w:t>(Заказной номер оборудования)</w:t>
       </w:r>
@@ -553,7 +705,8 @@
         <w:rPr>
           <w:rFonts w:ascii="Arial" w:hAnsi="Arial" w:cs="Arial"/>
           <w:b w:val="0"/>
-          <w:sz w:val="20"/>
+          <w:sz w:val="22"/>
+          <w:szCs w:val="22"/>
           <w:lang w:val="en-US"/>
         </w:rPr>
       </w:pPr>
@@ -561,10 +714,42 @@
         <w:rPr>
           <w:rFonts w:ascii="Arial" w:hAnsi="Arial" w:cs="Arial"/>
           <w:b w:val="0"/>
-          <w:sz w:val="20"/>
+          <w:sz w:val="22"/>
+          <w:szCs w:val="22"/>
+        </w:rPr>
+        <w:t xml:space="preserve"> </w:t>
+      </w:r>
+      <w:r>
+        <w:rPr>
+          <w:rFonts w:ascii="Arial" w:hAnsi="Arial" w:cs="Arial"/>
+          <w:b w:val="0"/>
+          <w:sz w:val="22"/>
+          <w:szCs w:val="22"/>
           <w:lang w:val="en-US"/>
         </w:rPr>
-        <w:t xml:space="preserve">{{SerialNumber}}</w:t>
+        <w:t>{{</w:t>
+      </w:r>
+      <w:proofErr w:type="spellStart"/>
+      <w:r>
+        <w:rPr>
+          <w:rFonts w:ascii="Arial" w:hAnsi="Arial" w:cs="Arial"/>
+          <w:b w:val="0"/>
+          <w:sz w:val="22"/>
+          <w:szCs w:val="22"/>
+          <w:lang w:val="en-US"/>
+        </w:rPr>
+        <w:t>SerialNumber</w:t>
+      </w:r>
+      <w:proofErr w:type="spellEnd"/>
+      <w:r>
+        <w:rPr>
+          <w:rFonts w:ascii="Arial" w:hAnsi="Arial" w:cs="Arial"/>
+          <w:b w:val="0"/>
+          <w:sz w:val="22"/>
+          <w:szCs w:val="22"/>
+          <w:lang w:val="en-US"/>
+        </w:rPr>
+        <w:t>}}</w:t>
       </w:r>
     </w:p>
     <w:p>
@@ -616,14 +801,16 @@
         <w:rPr>
           <w:rFonts w:ascii="Arial" w:hAnsi="Arial" w:cs="Arial"/>
           <w:b w:val="0"/>
-          <w:sz w:val="20"/>
-        </w:rPr>
-      </w:pPr>
-      <w:r>
-        <w:rPr>
-          <w:rFonts w:ascii="Arial" w:hAnsi="Arial" w:cs="Arial"/>
-          <w:b w:val="0"/>
-          <w:sz w:val="20"/>
+          <w:sz w:val="18"/>
+          <w:szCs w:val="18"/>
+        </w:rPr>
+      </w:pPr>
+      <w:r>
+        <w:rPr>
+          <w:rFonts w:ascii="Arial" w:hAnsi="Arial" w:cs="Arial"/>
+          <w:b w:val="0"/>
+          <w:sz w:val="18"/>
+          <w:szCs w:val="18"/>
         </w:rPr>
         <w:t>(Серийный номер оборудования)</w:t>
       </w:r>
@@ -648,17 +835,50 @@
         <w:rPr>
           <w:rFonts w:ascii="Arial" w:hAnsi="Arial" w:cs="Arial"/>
           <w:b w:val="0"/>
-          <w:sz w:val="20"/>
-        </w:rPr>
-      </w:pPr>
-      <w:r>
-        <w:rPr>
-          <w:rFonts w:ascii="Arial" w:hAnsi="Arial" w:cs="Arial"/>
-          <w:b w:val="0"/>
-          <w:sz w:val="20"/>
+          <w:sz w:val="22"/>
+          <w:szCs w:val="22"/>
+        </w:rPr>
+      </w:pPr>
+      <w:r>
+        <w:rPr>
+          <w:rFonts w:ascii="Arial" w:hAnsi="Arial" w:cs="Arial"/>
+          <w:b w:val="0"/>
+          <w:sz w:val="22"/>
+          <w:szCs w:val="22"/>
+        </w:rPr>
+        <w:t xml:space="preserve"> </w:t>
+      </w:r>
+      <w:r>
+        <w:rPr>
+          <w:rFonts w:ascii="Arial" w:hAnsi="Arial" w:cs="Arial"/>
+          <w:b w:val="0"/>
+          <w:sz w:val="22"/>
+          <w:szCs w:val="22"/>
           <w:lang w:val="en-US"/>
         </w:rPr>
-        <w:t xml:space="preserve">{{FailureDate}}</w:t>
+        <w:t>{{</w:t>
+      </w:r>
+      <w:proofErr w:type="spellStart"/>
+      <w:r>
+        <w:rPr>
+          <w:rFonts w:ascii="Arial" w:hAnsi="Arial" w:cs="Arial"/>
+          <w:b w:val="0"/>
+          <w:sz w:val="22"/>
+          <w:szCs w:val="22"/>
+          <w:lang w:val="en-US"/>
+        </w:rPr>
+        <w:t>FailureDate</w:t>
+      </w:r>
+      <w:proofErr w:type="spellEnd"/>
+      <w:r>
+        <w:rPr>
+          <w:rFonts w:ascii="Arial" w:hAnsi="Arial" w:cs="Arial"/>
+          <w:b w:val="0"/>
+          <w:sz w:val="22"/>
+          <w:szCs w:val="22"/>
+          <w:lang w:val="en-US"/>
+        </w:rPr>
+        <w:t>}}</w:t>
       </w:r>
     </w:p>
     <w:p>
@@ -707,14 +927,16 @@
         <w:rPr>
           <w:rFonts w:ascii="Arial" w:hAnsi="Arial" w:cs="Arial"/>
           <w:b w:val="0"/>
-          <w:sz w:val="20"/>
-        </w:rPr>
-      </w:pPr>
-      <w:r>
-        <w:rPr>
-          <w:rFonts w:ascii="Arial" w:hAnsi="Arial" w:cs="Arial"/>
-          <w:b w:val="0"/>
-          <w:sz w:val="20"/>
+          <w:sz w:val="18"/>
+          <w:szCs w:val="18"/>
+        </w:rPr>
+      </w:pPr>
+      <w:r>
+        <w:rPr>
+          <w:rFonts w:ascii="Arial" w:hAnsi="Arial" w:cs="Arial"/>
+          <w:b w:val="0"/>
+          <w:sz w:val="18"/>
+          <w:szCs w:val="18"/>
         </w:rPr>
         <w:t>(Дата выхода из строя/отказа)</w:t>
       </w:r>
@@ -739,16 +961,47 @@
         <w:rPr>
           <w:rFonts w:ascii="Arial" w:hAnsi="Arial" w:cs="Arial"/>
           <w:b w:val="0"/>
-          <w:sz w:val="20"/>
-        </w:rPr>
-      </w:pPr>
-      <w:r>
-        <w:rPr>
-          <w:rFonts w:ascii="Arial" w:hAnsi="Arial" w:cs="Arial"/>
-          <w:b w:val="0"/>
-          <w:sz w:val="20"/>
-        </w:rPr>
-        <w:t xml:space="preserve">{{FaultDescription}}</w:t>
+          <w:sz w:val="22"/>
+          <w:szCs w:val="22"/>
+        </w:rPr>
+      </w:pPr>
+      <w:r>
+        <w:rPr>
+          <w:rFonts w:ascii="Arial" w:hAnsi="Arial" w:cs="Arial"/>
+          <w:b w:val="0"/>
+          <w:sz w:val="22"/>
+          <w:szCs w:val="22"/>
+        </w:rPr>
+        <w:t xml:space="preserve"> </w:t>
+      </w:r>
+      <w:r>
+        <w:rPr>
+          <w:rFonts w:ascii="Arial" w:hAnsi="Arial" w:cs="Arial"/>
+          <w:b w:val="0"/>
+          <w:sz w:val="22"/>
+          <w:szCs w:val="22"/>
+        </w:rPr>
+        <w:t>{{</w:t>
+      </w:r>
+      <w:proofErr w:type="spellStart"/>
+      <w:r>
+        <w:rPr>
+          <w:rFonts w:ascii="Arial" w:hAnsi="Arial" w:cs="Arial"/>
+          <w:b w:val="0"/>
+          <w:sz w:val="22"/>
+          <w:szCs w:val="22"/>
+        </w:rPr>
+        <w:t>FaultDescription</w:t>
+      </w:r>
+      <w:proofErr w:type="spellEnd"/>
+      <w:r>
+        <w:rPr>
+          <w:rFonts w:ascii="Arial" w:hAnsi="Arial" w:cs="Arial"/>
+          <w:b w:val="0"/>
+          <w:sz w:val="22"/>
+          <w:szCs w:val="22"/>
+        </w:rPr>
+        <w:t>}}</w:t>
       </w:r>
     </w:p>
     <w:p>
@@ -806,14 +1059,16 @@
         <w:rPr>
           <w:rFonts w:ascii="Arial" w:hAnsi="Arial" w:cs="Arial"/>
           <w:b w:val="0"/>
-          <w:sz w:val="20"/>
-        </w:rPr>
-      </w:pPr>
-      <w:r>
-        <w:rPr>
-          <w:rFonts w:ascii="Arial" w:hAnsi="Arial" w:cs="Arial"/>
-          <w:b w:val="0"/>
-          <w:sz w:val="20"/>
+          <w:sz w:val="18"/>
+          <w:szCs w:val="18"/>
+        </w:rPr>
+      </w:pPr>
+      <w:r>
+        <w:rPr>
+          <w:rFonts w:ascii="Arial" w:hAnsi="Arial" w:cs="Arial"/>
+          <w:b w:val="0"/>
+          <w:sz w:val="18"/>
+          <w:szCs w:val="18"/>
         </w:rPr>
         <w:t>(Описание неисправности/отказа)</w:t>
       </w:r>
@@ -838,17 +1093,47 @@
         <w:rPr>
           <w:rFonts w:ascii="Arial" w:hAnsi="Arial" w:cs="Arial"/>
           <w:b w:val="0"/>
-          <w:sz w:val="6"/>
-          <w:szCs w:val="6"/>
-        </w:rPr>
-      </w:pPr>
-      <w:r>
-        <w:rPr>
-          <w:rFonts w:ascii="Arial" w:hAnsi="Arial" w:cs="Arial"/>
-          <w:b w:val="0"/>
-          <w:sz w:val="20"/>
-        </w:rPr>
-        <w:t xml:space="preserve">{{FailureReason}}</w:t>
+          <w:sz w:val="22"/>
+          <w:szCs w:val="22"/>
+        </w:rPr>
+      </w:pPr>
+      <w:r>
+        <w:rPr>
+          <w:rFonts w:ascii="Arial" w:hAnsi="Arial" w:cs="Arial"/>
+          <w:b w:val="0"/>
+          <w:sz w:val="22"/>
+          <w:szCs w:val="22"/>
+        </w:rPr>
+        <w:t xml:space="preserve"> </w:t>
+      </w:r>
+      <w:r>
+        <w:rPr>
+          <w:rFonts w:ascii="Arial" w:hAnsi="Arial" w:cs="Arial"/>
+          <w:b w:val="0"/>
+          <w:sz w:val="22"/>
+          <w:szCs w:val="22"/>
+        </w:rPr>
+        <w:t>{{</w:t>
+      </w:r>
+      <w:proofErr w:type="spellStart"/>
+      <w:r>
+        <w:rPr>
+          <w:rFonts w:ascii="Arial" w:hAnsi="Arial" w:cs="Arial"/>
+          <w:b w:val="0"/>
+          <w:sz w:val="22"/>
+          <w:szCs w:val="22"/>
+        </w:rPr>
+        <w:t>FailureReason</w:t>
+      </w:r>
+      <w:proofErr w:type="spellEnd"/>
+      <w:r>
+        <w:rPr>
+          <w:rFonts w:ascii="Arial" w:hAnsi="Arial" w:cs="Arial"/>
+          <w:b w:val="0"/>
+          <w:sz w:val="22"/>
+          <w:szCs w:val="22"/>
+        </w:rPr>
+        <w:t>}}</w:t>
       </w:r>
     </w:p>
     <w:p>
@@ -880,14 +1165,16 @@
         <w:rPr>
           <w:rFonts w:ascii="Arial" w:hAnsi="Arial" w:cs="Arial"/>
           <w:b w:val="0"/>
-          <w:sz w:val="20"/>
-        </w:rPr>
-      </w:pPr>
-      <w:r>
-        <w:rPr>
-          <w:rFonts w:ascii="Arial" w:hAnsi="Arial" w:cs="Arial"/>
-          <w:b w:val="0"/>
-          <w:sz w:val="20"/>
+          <w:sz w:val="18"/>
+          <w:szCs w:val="18"/>
+        </w:rPr>
+      </w:pPr>
+      <w:r>
+        <w:rPr>
+          <w:rFonts w:ascii="Arial" w:hAnsi="Arial" w:cs="Arial"/>
+          <w:b w:val="0"/>
+          <w:sz w:val="18"/>
+          <w:szCs w:val="18"/>
         </w:rPr>
         <w:t xml:space="preserve">                                               </w:t>
       </w:r>
@@ -895,7 +1182,8 @@
         <w:rPr>
           <w:rFonts w:ascii="Arial" w:hAnsi="Arial" w:cs="Arial"/>
           <w:b w:val="0"/>
-          <w:sz w:val="20"/>
+          <w:sz w:val="18"/>
+          <w:szCs w:val="18"/>
         </w:rPr>
         <w:t xml:space="preserve"> </w:t>
       </w:r>
@@ -903,7 +1191,8 @@
         <w:rPr>
           <w:rFonts w:ascii="Arial" w:hAnsi="Arial" w:cs="Arial"/>
           <w:b w:val="0"/>
-          <w:sz w:val="20"/>
+          <w:sz w:val="18"/>
+          <w:szCs w:val="18"/>
         </w:rPr>
         <w:t>(Возможная причина выхода из строя)</w:t>
       </w:r>
@@ -928,73 +1217,68 @@
         <w:rPr>
           <w:rFonts w:ascii="Arial" w:hAnsi="Arial" w:cs="Arial"/>
           <w:b w:val="0"/>
+          <w:sz w:val="22"/>
+          <w:szCs w:val="22"/>
+        </w:rPr>
+      </w:pPr>
+      <w:r>
+        <w:rPr>
+          <w:rFonts w:ascii="Arial" w:hAnsi="Arial" w:cs="Arial"/>
+          <w:b w:val="0"/>
+          <w:sz w:val="22"/>
+          <w:szCs w:val="22"/>
+        </w:rPr>
+        <w:t>Должности</w:t>
+      </w:r>
+      <w:r>
+        <w:rPr>
+          <w:rFonts w:ascii="Arial" w:hAnsi="Arial" w:cs="Arial"/>
+          <w:b w:val="0"/>
+          <w:sz w:val="22"/>
+          <w:szCs w:val="22"/>
+        </w:rPr>
+        <w:t xml:space="preserve"> и фамилии </w:t>
+      </w:r>
+      <w:r>
+        <w:rPr>
+          <w:rFonts w:ascii="Arial" w:hAnsi="Arial" w:cs="Arial"/>
+          <w:b w:val="0"/>
+          <w:sz w:val="22"/>
+          <w:szCs w:val="22"/>
+        </w:rPr>
+        <w:t>членов комиссии</w:t>
+      </w:r>
+      <w:r>
+        <w:rPr>
+          <w:rFonts w:ascii="Arial" w:hAnsi="Arial" w:cs="Arial"/>
+          <w:b w:val="0"/>
+          <w:sz w:val="22"/>
+          <w:szCs w:val="22"/>
+        </w:rPr>
+        <w:t>,</w:t>
+      </w:r>
+      <w:r>
+        <w:rPr>
+          <w:rFonts w:ascii="Arial" w:hAnsi="Arial" w:cs="Arial"/>
+          <w:b w:val="0"/>
+          <w:sz w:val="22"/>
+          <w:szCs w:val="22"/>
+        </w:rPr>
+        <w:t xml:space="preserve"> участвующих в составлении рекламационного акта </w:t>
+      </w:r>
+    </w:p>
+    <w:p>
+      <w:pPr>
+        <w:pStyle w:val="a4"/>
+        <w:jc w:val="center"/>
+        <w:rPr>
+          <w:rFonts w:ascii="Arial" w:hAnsi="Arial" w:cs="Arial"/>
+          <w:b w:val="0"/>
           <w:sz w:val="20"/>
         </w:rPr>
       </w:pPr>
-      <w:r>
-        <w:rPr>
-          <w:rFonts w:ascii="Arial" w:hAnsi="Arial" w:cs="Arial"/>
-          <w:b w:val="0"/>
-          <w:sz w:val="20"/>
-        </w:rPr>
-        <w:t>Должности</w:t>
-      </w:r>
-      <w:r>
-        <w:rPr>
-          <w:rFonts w:ascii="Arial" w:hAnsi="Arial" w:cs="Arial"/>
-          <w:b w:val="0"/>
-          <w:sz w:val="20"/>
-        </w:rPr>
-        <w:t xml:space="preserve"> и фамилии </w:t>
-      </w:r>
-      <w:r>
-        <w:rPr>
-          <w:rFonts w:ascii="Arial" w:hAnsi="Arial" w:cs="Arial"/>
-          <w:b w:val="0"/>
-          <w:sz w:val="20"/>
-        </w:rPr>
-        <w:t>членов комиссии</w:t>
-      </w:r>
-      <w:r>
-        <w:rPr>
-          <w:rFonts w:ascii="Arial" w:hAnsi="Arial" w:cs="Arial"/>
-          <w:b w:val="0"/>
-          <w:sz w:val="20"/>
-        </w:rPr>
-        <w:t>,</w:t>
-      </w:r>
-      <w:r>
-        <w:rPr>
-          <w:rFonts w:ascii="Arial" w:hAnsi="Arial" w:cs="Arial"/>
-          <w:b w:val="0"/>
-          <w:sz w:val="20"/>
-        </w:rPr>
-        <w:t xml:space="preserve"> участвующих в составлении рекламационного акта </w:t>
-      </w:r>
-    </w:p>
-    <w:p>
-      <w:pPr>
-        <w:pStyle w:val="a4"/>
-        <w:jc w:val="center"/>
-        <w:rPr>
-          <w:rFonts w:ascii="Arial" w:hAnsi="Arial" w:cs="Arial"/>
-          <w:b w:val="0"/>
-          <w:sz w:val="20"/>
-        </w:rPr>
-      </w:pPr>
-    </w:p>
-    <w:p>
-      <w:pPr>
-        <w:pStyle w:val="a4"/>
-        <w:jc w:val="center"/>
-        <w:rPr>
-          <w:rFonts w:ascii="Arial" w:hAnsi="Arial" w:cs="Arial"/>
-          <w:b w:val="0"/>
-          <w:sz w:val="20"/>
-        </w:rPr>
-      </w:pPr>
-    </w:p>
-    <w:tbl xmlns:w="http://schemas.openxmlformats.org/wordprocessingml/2006/main">
+    </w:p>
+    <w:tbl>
       <w:tblPr>
         <w:tblW w:w="9000" w:type="dxa"/>
         <w:tblBorders>
@@ -1009,6 +1293,7 @@
           <w:left w:w="0" w:type="dxa"/>
           <w:right w:w="0" w:type="dxa"/>
         </w:tblCellMar>
+        <w:tblLook w:val="04A0" w:firstRow="1" w:lastRow="0" w:firstColumn="1" w:lastColumn="0" w:noHBand="0" w:noVBand="1"/>
       </w:tblPr>
       <w:tblGrid>
         <w:gridCol w:w="3900"/>
@@ -1017,7 +1302,7 @@
       </w:tblGrid>
       <w:tr>
         <w:trPr>
-          <w:trHeight w:val="460" w:hRule="atLeast"/>
+          <w:trHeight w:val="460"/>
         </w:trPr>
         <w:tc>
           <w:tcPr>
@@ -1025,29 +1310,38 @@
             <w:tcBorders>
               <w:bottom w:val="single" w:sz="2" w:space="0" w:color="auto"/>
             </w:tcBorders>
-            <w:vAlign w:val="bottom"/>
             <w:tcMar>
               <w:top w:w="0" w:type="dxa"/>
               <w:left w:w="0" w:type="dxa"/>
               <w:bottom w:w="0" w:type="dxa"/>
               <w:right w:w="0" w:type="dxa"/>
             </w:tcMar>
+            <w:vAlign w:val="bottom"/>
           </w:tcPr>
           <w:p>
             <w:pPr>
-              <w:spacing w:before="0" w:after="0"/>
-              <w:jc w:val="left"/>
-              <w:rPr>
-                <w:rFonts w:ascii="Arial" w:hAnsi="Arial" w:cs="Arial"/>
-                <w:sz w:val="20"/>
+              <w:rPr>
+                <w:rFonts w:ascii="Arial" w:hAnsi="Arial" w:cs="Arial"/>
+                <w:sz w:val="22"/>
+                <w:szCs w:val="22"/>
               </w:rPr>
             </w:pPr>
             <w:r>
               <w:rPr>
                 <w:rFonts w:ascii="Arial" w:hAnsi="Arial" w:cs="Arial"/>
-                <w:sz w:val="20"/>
-              </w:rPr>
-              <w:t xml:space="preserve">{{Executor1Position}}</w:t>
+                <w:sz w:val="22"/>
+                <w:szCs w:val="22"/>
+                <w:lang w:val="ru-RU"/>
+              </w:rPr>
+              <w:t xml:space="preserve"> </w:t>
+            </w:r>
+            <w:r>
+              <w:rPr>
+                <w:rFonts w:ascii="Arial" w:hAnsi="Arial" w:cs="Arial"/>
+                <w:sz w:val="22"/>
+                <w:szCs w:val="22"/>
+              </w:rPr>
+              <w:t>{{Executor1Position}}</w:t>
             </w:r>
           </w:p>
         </w:tc>
@@ -1063,36 +1357,46 @@
             <w:tcBorders>
               <w:bottom w:val="single" w:sz="2" w:space="0" w:color="auto"/>
             </w:tcBorders>
-            <w:vAlign w:val="bottom"/>
             <w:tcMar>
               <w:top w:w="0" w:type="dxa"/>
               <w:left w:w="0" w:type="dxa"/>
               <w:bottom w:w="0" w:type="dxa"/>
               <w:right w:w="0" w:type="dxa"/>
             </w:tcMar>
+            <w:vAlign w:val="bottom"/>
           </w:tcPr>
           <w:p>
             <w:pPr>
-              <w:spacing w:before="0" w:after="0"/>
               <w:jc w:val="center"/>
               <w:rPr>
                 <w:rFonts w:ascii="Arial" w:hAnsi="Arial" w:cs="Arial"/>
-                <w:sz w:val="20"/>
+                <w:sz w:val="22"/>
+                <w:szCs w:val="22"/>
               </w:rPr>
             </w:pPr>
             <w:r>
               <w:rPr>
                 <w:rFonts w:ascii="Arial" w:hAnsi="Arial" w:cs="Arial"/>
-                <w:sz w:val="20"/>
-              </w:rPr>
-              <w:t xml:space="preserve">{{Executor1Name}}</w:t>
+                <w:sz w:val="22"/>
+                <w:szCs w:val="22"/>
+                <w:lang w:val="ru-RU"/>
+              </w:rPr>
+              <w:t xml:space="preserve">                </w:t>
+            </w:r>
+            <w:r>
+              <w:rPr>
+                <w:rFonts w:ascii="Arial" w:hAnsi="Arial" w:cs="Arial"/>
+                <w:sz w:val="22"/>
+                <w:szCs w:val="22"/>
+              </w:rPr>
+              <w:t>{{Executor1Name}}</w:t>
             </w:r>
           </w:p>
         </w:tc>
       </w:tr>
       <w:tr>
         <w:trPr>
-          <w:trHeight w:val="260" w:hRule="atLeast"/>
+          <w:trHeight w:val="260"/>
         </w:trPr>
         <w:tc>
           <w:tcPr>
@@ -1106,17 +1410,18 @@
           </w:tcPr>
           <w:p>
             <w:pPr>
-              <w:spacing w:before="0" w:after="0"/>
               <w:jc w:val="center"/>
               <w:rPr>
                 <w:rFonts w:ascii="Arial" w:hAnsi="Arial" w:cs="Arial"/>
-                <w:sz w:val="20"/>
+                <w:sz w:val="18"/>
+                <w:szCs w:val="18"/>
               </w:rPr>
             </w:pPr>
             <w:r>
               <w:rPr>
                 <w:rFonts w:ascii="Arial" w:hAnsi="Arial" w:cs="Arial"/>
-                <w:sz w:val="20"/>
+                <w:sz w:val="18"/>
+                <w:szCs w:val="18"/>
               </w:rPr>
               <w:t>(должность)</w:t>
             </w:r>
@@ -1140,17 +1445,18 @@
           </w:tcPr>
           <w:p>
             <w:pPr>
-              <w:spacing w:before="0" w:after="0"/>
               <w:jc w:val="center"/>
               <w:rPr>
                 <w:rFonts w:ascii="Arial" w:hAnsi="Arial" w:cs="Arial"/>
-                <w:sz w:val="20"/>
+                <w:sz w:val="18"/>
+                <w:szCs w:val="18"/>
               </w:rPr>
             </w:pPr>
             <w:r>
               <w:rPr>
                 <w:rFonts w:ascii="Arial" w:hAnsi="Arial" w:cs="Arial"/>
-                <w:sz w:val="20"/>
+                <w:sz w:val="18"/>
+                <w:szCs w:val="18"/>
               </w:rPr>
               <w:t>(Фамилия И.О.)</w:t>
             </w:r>
@@ -1159,7 +1465,7 @@
       </w:tr>
       <w:tr>
         <w:trPr>
-          <w:trHeight w:val="160" w:hRule="exact"/>
+          <w:trHeight w:hRule="exact" w:val="160"/>
         </w:trPr>
         <w:tc>
           <w:tcPr>
@@ -1182,7 +1488,7 @@
       </w:tr>
       <w:tr>
         <w:trPr>
-          <w:trHeight w:val="460" w:hRule="atLeast"/>
+          <w:trHeight w:val="460"/>
         </w:trPr>
         <w:tc>
           <w:tcPr>
@@ -1190,29 +1496,38 @@
             <w:tcBorders>
               <w:bottom w:val="single" w:sz="2" w:space="0" w:color="auto"/>
             </w:tcBorders>
-            <w:vAlign w:val="bottom"/>
             <w:tcMar>
               <w:top w:w="0" w:type="dxa"/>
               <w:left w:w="0" w:type="dxa"/>
               <w:bottom w:w="0" w:type="dxa"/>
               <w:right w:w="0" w:type="dxa"/>
             </w:tcMar>
+            <w:vAlign w:val="bottom"/>
           </w:tcPr>
           <w:p>
             <w:pPr>
-              <w:spacing w:before="0" w:after="0"/>
-              <w:jc w:val="left"/>
-              <w:rPr>
-                <w:rFonts w:ascii="Arial" w:hAnsi="Arial" w:cs="Arial"/>
-                <w:sz w:val="20"/>
+              <w:rPr>
+                <w:rFonts w:ascii="Arial" w:hAnsi="Arial" w:cs="Arial"/>
+                <w:sz w:val="22"/>
+                <w:szCs w:val="22"/>
               </w:rPr>
             </w:pPr>
             <w:r>
               <w:rPr>
                 <w:rFonts w:ascii="Arial" w:hAnsi="Arial" w:cs="Arial"/>
-                <w:sz w:val="20"/>
-              </w:rPr>
-              <w:t xml:space="preserve">{{Executor2Position}}</w:t>
+                <w:sz w:val="22"/>
+                <w:szCs w:val="22"/>
+                <w:lang w:val="ru-RU"/>
+              </w:rPr>
+              <w:t xml:space="preserve"> </w:t>
+            </w:r>
+            <w:r>
+              <w:rPr>
+                <w:rFonts w:ascii="Arial" w:hAnsi="Arial" w:cs="Arial"/>
+                <w:sz w:val="22"/>
+                <w:szCs w:val="22"/>
+              </w:rPr>
+              <w:t>{{Executor2Position}}</w:t>
             </w:r>
           </w:p>
         </w:tc>
@@ -1228,36 +1543,46 @@
             <w:tcBorders>
               <w:bottom w:val="single" w:sz="2" w:space="0" w:color="auto"/>
             </w:tcBorders>
-            <w:vAlign w:val="bottom"/>
             <w:tcMar>
               <w:top w:w="0" w:type="dxa"/>
               <w:left w:w="0" w:type="dxa"/>
               <w:bottom w:w="0" w:type="dxa"/>
               <w:right w:w="0" w:type="dxa"/>
             </w:tcMar>
+            <w:vAlign w:val="bottom"/>
           </w:tcPr>
           <w:p>
             <w:pPr>
-              <w:spacing w:before="0" w:after="0"/>
               <w:jc w:val="center"/>
               <w:rPr>
                 <w:rFonts w:ascii="Arial" w:hAnsi="Arial" w:cs="Arial"/>
-                <w:sz w:val="20"/>
+                <w:sz w:val="22"/>
+                <w:szCs w:val="22"/>
               </w:rPr>
             </w:pPr>
             <w:r>
               <w:rPr>
                 <w:rFonts w:ascii="Arial" w:hAnsi="Arial" w:cs="Arial"/>
-                <w:sz w:val="20"/>
-              </w:rPr>
-              <w:t xml:space="preserve">{{Executor2Name}}</w:t>
+                <w:sz w:val="22"/>
+                <w:szCs w:val="22"/>
+                <w:lang w:val="ru-RU"/>
+              </w:rPr>
+              <w:t xml:space="preserve">                </w:t>
+            </w:r>
+            <w:r>
+              <w:rPr>
+                <w:rFonts w:ascii="Arial" w:hAnsi="Arial" w:cs="Arial"/>
+                <w:sz w:val="22"/>
+                <w:szCs w:val="22"/>
+              </w:rPr>
+              <w:t>{{Executor2Name}}</w:t>
             </w:r>
           </w:p>
         </w:tc>
       </w:tr>
       <w:tr>
         <w:trPr>
-          <w:trHeight w:val="260" w:hRule="atLeast"/>
+          <w:trHeight w:val="260"/>
         </w:trPr>
         <w:tc>
           <w:tcPr>
@@ -1271,17 +1596,18 @@
           </w:tcPr>
           <w:p>
             <w:pPr>
-              <w:spacing w:before="0" w:after="0"/>
               <w:jc w:val="center"/>
               <w:rPr>
                 <w:rFonts w:ascii="Arial" w:hAnsi="Arial" w:cs="Arial"/>
-                <w:sz w:val="20"/>
+                <w:sz w:val="18"/>
+                <w:szCs w:val="18"/>
               </w:rPr>
             </w:pPr>
             <w:r>
               <w:rPr>
                 <w:rFonts w:ascii="Arial" w:hAnsi="Arial" w:cs="Arial"/>
-                <w:sz w:val="20"/>
+                <w:sz w:val="18"/>
+                <w:szCs w:val="18"/>
               </w:rPr>
               <w:t>(должность)</w:t>
             </w:r>
@@ -1291,7 +1617,14 @@
           <w:tcPr>
             <w:tcW w:w="1200" w:type="dxa"/>
           </w:tcPr>
-          <w:p/>
+          <w:p>
+            <w:pPr>
+              <w:rPr>
+                <w:sz w:val="18"/>
+                <w:szCs w:val="18"/>
+              </w:rPr>
+            </w:pPr>
+          </w:p>
         </w:tc>
         <w:tc>
           <w:tcPr>
@@ -1305,17 +1638,18 @@
           </w:tcPr>
           <w:p>
             <w:pPr>
-              <w:spacing w:before="0" w:after="0"/>
               <w:jc w:val="center"/>
               <w:rPr>
                 <w:rFonts w:ascii="Arial" w:hAnsi="Arial" w:cs="Arial"/>
-                <w:sz w:val="20"/>
+                <w:sz w:val="18"/>
+                <w:szCs w:val="18"/>
               </w:rPr>
             </w:pPr>
             <w:r>
               <w:rPr>
                 <w:rFonts w:ascii="Arial" w:hAnsi="Arial" w:cs="Arial"/>
-                <w:sz w:val="20"/>
+                <w:sz w:val="18"/>
+                <w:szCs w:val="18"/>
               </w:rPr>
               <w:t>(Фамилия И.О.)</w:t>
             </w:r>
@@ -1324,7 +1658,7 @@
       </w:tr>
       <w:tr>
         <w:trPr>
-          <w:trHeight w:val="160" w:hRule="exact"/>
+          <w:trHeight w:hRule="exact" w:val="160"/>
         </w:trPr>
         <w:tc>
           <w:tcPr>
@@ -1347,7 +1681,7 @@
       </w:tr>
       <w:tr>
         <w:trPr>
-          <w:trHeight w:val="460" w:hRule="atLeast"/>
+          <w:trHeight w:val="460"/>
         </w:trPr>
         <w:tc>
           <w:tcPr>
@@ -1355,29 +1689,38 @@
             <w:tcBorders>
               <w:bottom w:val="single" w:sz="2" w:space="0" w:color="auto"/>
             </w:tcBorders>
-            <w:vAlign w:val="bottom"/>
             <w:tcMar>
               <w:top w:w="0" w:type="dxa"/>
               <w:left w:w="0" w:type="dxa"/>
               <w:bottom w:w="0" w:type="dxa"/>
               <w:right w:w="0" w:type="dxa"/>
             </w:tcMar>
+            <w:vAlign w:val="bottom"/>
           </w:tcPr>
           <w:p>
             <w:pPr>
-              <w:spacing w:before="0" w:after="0"/>
-              <w:jc w:val="left"/>
-              <w:rPr>
-                <w:rFonts w:ascii="Arial" w:hAnsi="Arial" w:cs="Arial"/>
-                <w:sz w:val="20"/>
+              <w:rPr>
+                <w:rFonts w:ascii="Arial" w:hAnsi="Arial" w:cs="Arial"/>
+                <w:sz w:val="22"/>
+                <w:szCs w:val="22"/>
               </w:rPr>
             </w:pPr>
             <w:r>
               <w:rPr>
                 <w:rFonts w:ascii="Arial" w:hAnsi="Arial" w:cs="Arial"/>
-                <w:sz w:val="20"/>
-              </w:rPr>
-              <w:t xml:space="preserve">{{Executor3Position}}</w:t>
+                <w:sz w:val="22"/>
+                <w:szCs w:val="22"/>
+                <w:lang w:val="ru-RU"/>
+              </w:rPr>
+              <w:t xml:space="preserve"> </w:t>
+            </w:r>
+            <w:r>
+              <w:rPr>
+                <w:rFonts w:ascii="Arial" w:hAnsi="Arial" w:cs="Arial"/>
+                <w:sz w:val="22"/>
+                <w:szCs w:val="22"/>
+              </w:rPr>
+              <w:t>{{Executor3Position}}</w:t>
             </w:r>
           </w:p>
         </w:tc>
@@ -1393,36 +1736,46 @@
             <w:tcBorders>
               <w:bottom w:val="single" w:sz="2" w:space="0" w:color="auto"/>
             </w:tcBorders>
-            <w:vAlign w:val="bottom"/>
             <w:tcMar>
               <w:top w:w="0" w:type="dxa"/>
               <w:left w:w="0" w:type="dxa"/>
               <w:bottom w:w="0" w:type="dxa"/>
               <w:right w:w="0" w:type="dxa"/>
             </w:tcMar>
+            <w:vAlign w:val="bottom"/>
           </w:tcPr>
           <w:p>
             <w:pPr>
-              <w:spacing w:before="0" w:after="0"/>
               <w:jc w:val="center"/>
               <w:rPr>
                 <w:rFonts w:ascii="Arial" w:hAnsi="Arial" w:cs="Arial"/>
-                <w:sz w:val="20"/>
+                <w:sz w:val="22"/>
+                <w:szCs w:val="22"/>
               </w:rPr>
             </w:pPr>
             <w:r>
               <w:rPr>
                 <w:rFonts w:ascii="Arial" w:hAnsi="Arial" w:cs="Arial"/>
-                <w:sz w:val="20"/>
-              </w:rPr>
-              <w:t xml:space="preserve">{{Executor3Name}}</w:t>
+                <w:sz w:val="22"/>
+                <w:szCs w:val="22"/>
+                <w:lang w:val="ru-RU"/>
+              </w:rPr>
+              <w:t xml:space="preserve">                </w:t>
+            </w:r>
+            <w:r>
+              <w:rPr>
+                <w:rFonts w:ascii="Arial" w:hAnsi="Arial" w:cs="Arial"/>
+                <w:sz w:val="22"/>
+                <w:szCs w:val="22"/>
+              </w:rPr>
+              <w:t>{{Executor3Name}}</w:t>
             </w:r>
           </w:p>
         </w:tc>
       </w:tr>
       <w:tr>
         <w:trPr>
-          <w:trHeight w:val="260" w:hRule="atLeast"/>
+          <w:trHeight w:val="260"/>
         </w:trPr>
         <w:tc>
           <w:tcPr>
@@ -1436,17 +1789,18 @@
           </w:tcPr>
           <w:p>
             <w:pPr>
-              <w:spacing w:before="0" w:after="0"/>
               <w:jc w:val="center"/>
               <w:rPr>
                 <w:rFonts w:ascii="Arial" w:hAnsi="Arial" w:cs="Arial"/>
-                <w:sz w:val="20"/>
+                <w:sz w:val="18"/>
+                <w:szCs w:val="18"/>
               </w:rPr>
             </w:pPr>
             <w:r>
               <w:rPr>
                 <w:rFonts w:ascii="Arial" w:hAnsi="Arial" w:cs="Arial"/>
-                <w:sz w:val="20"/>
+                <w:sz w:val="18"/>
+                <w:szCs w:val="18"/>
               </w:rPr>
               <w:t>(должность)</w:t>
             </w:r>
@@ -1456,7 +1810,14 @@
           <w:tcPr>
             <w:tcW w:w="1200" w:type="dxa"/>
           </w:tcPr>
-          <w:p/>
+          <w:p>
+            <w:pPr>
+              <w:rPr>
+                <w:sz w:val="18"/>
+                <w:szCs w:val="18"/>
+              </w:rPr>
+            </w:pPr>
+          </w:p>
         </w:tc>
         <w:tc>
           <w:tcPr>
@@ -1470,17 +1831,18 @@
           </w:tcPr>
           <w:p>
             <w:pPr>
-              <w:spacing w:before="0" w:after="0"/>
               <w:jc w:val="center"/>
               <w:rPr>
                 <w:rFonts w:ascii="Arial" w:hAnsi="Arial" w:cs="Arial"/>
-                <w:sz w:val="20"/>
+                <w:sz w:val="18"/>
+                <w:szCs w:val="18"/>
               </w:rPr>
             </w:pPr>
             <w:r>
               <w:rPr>
                 <w:rFonts w:ascii="Arial" w:hAnsi="Arial" w:cs="Arial"/>
-                <w:sz w:val="20"/>
+                <w:sz w:val="18"/>
+                <w:szCs w:val="18"/>
               </w:rPr>
               <w:t>(Фамилия И.О.)</w:t>
             </w:r>
@@ -1504,14 +1866,16 @@
         <w:rPr>
           <w:rFonts w:ascii="Arial" w:hAnsi="Arial" w:cs="Arial"/>
           <w:b w:val="0"/>
-          <w:sz w:val="20"/>
-        </w:rPr>
-      </w:pPr>
-      <w:r>
-        <w:rPr>
-          <w:rFonts w:ascii="Arial" w:hAnsi="Arial" w:cs="Arial"/>
-          <w:b w:val="0"/>
-          <w:sz w:val="20"/>
+          <w:sz w:val="22"/>
+          <w:szCs w:val="22"/>
+        </w:rPr>
+      </w:pPr>
+      <w:r>
+        <w:rPr>
+          <w:rFonts w:ascii="Arial" w:hAnsi="Arial" w:cs="Arial"/>
+          <w:b w:val="0"/>
+          <w:sz w:val="22"/>
+          <w:szCs w:val="22"/>
         </w:rPr>
         <w:t>М.П. (Фирменная печать)</w:t>
       </w:r>
@@ -1522,9 +1886,12 @@
         <w:rPr>
           <w:rFonts w:ascii="Arial" w:hAnsi="Arial" w:cs="Arial"/>
           <w:b w:val="0"/>
-          <w:sz w:val="20"/>
-        </w:rPr>
-      </w:pPr>
+          <w:sz w:val="22"/>
+          <w:szCs w:val="22"/>
+        </w:rPr>
+      </w:pPr>
+      <w:bookmarkStart w:id="0" w:name="_GoBack"/>
+      <w:bookmarkEnd w:id="0"/>
     </w:p>
     <w:p>
       <w:pPr>
@@ -1552,14 +1919,16 @@
         <w:rPr>
           <w:rFonts w:ascii="Arial" w:hAnsi="Arial" w:cs="Arial"/>
           <w:b w:val="0"/>
-          <w:sz w:val="20"/>
-        </w:rPr>
-      </w:pPr>
-      <w:r>
-        <w:rPr>
-          <w:rFonts w:ascii="Arial" w:hAnsi="Arial" w:cs="Arial"/>
-          <w:b w:val="0"/>
-          <w:sz w:val="20"/>
+          <w:sz w:val="18"/>
+          <w:szCs w:val="18"/>
+        </w:rPr>
+      </w:pPr>
+      <w:r>
+        <w:rPr>
+          <w:rFonts w:ascii="Arial" w:hAnsi="Arial" w:cs="Arial"/>
+          <w:b w:val="0"/>
+          <w:sz w:val="18"/>
+          <w:szCs w:val="18"/>
         </w:rPr>
         <w:t xml:space="preserve">Ф.И.О., тел, факс, адрес электронной почты контактного лица </w:t>
       </w:r>
@@ -1595,7 +1964,7 @@
   <w:abstractNum w:abstractNumId="1" w15:restartNumberingAfterBreak="0">
     <w:nsid w:val="4D9E7C85"/>
     <w:multiLevelType w:val="singleLevel"/>
-    <w:tmpl w:val="25BE353A"/>
+    <w:tmpl w:val="BB46EC80"/>
     <w:lvl w:ilvl="0">
       <w:start w:val="1"/>
       <w:numFmt w:val="decimal"/>
@@ -1608,8 +1977,8 @@
         <w:ind w:left="360" w:hanging="360"/>
       </w:pPr>
       <w:rPr>
-        <w:sz w:val="18"/>
-        <w:szCs w:val="18"/>
+        <w:sz w:val="22"/>
+        <w:szCs w:val="22"/>
       </w:rPr>
     </w:lvl>
   </w:abstractNum>
@@ -1649,6 +2018,50 @@
     <w:lsdException w:name="Subtitle" w:qFormat="1"/>
     <w:lsdException w:name="Strong" w:qFormat="1"/>
     <w:lsdException w:name="Emphasis" w:qFormat="1"/>
+    <w:lsdException w:name="Normal Table" w:semiHidden="1" w:unhideWhenUsed="1"/>
+    <w:lsdException w:name="Table Simple 1" w:semiHidden="1" w:unhideWhenUsed="1"/>
+    <w:lsdException w:name="Table Simple 2" w:semiHidden="1" w:unhideWhenUsed="1"/>
+    <w:lsdException w:name="Table Simple 3" w:semiHidden="1" w:unhideWhenUsed="1"/>
+    <w:lsdException w:name="Table Classic 1" w:semiHidden="1" w:unhideWhenUsed="1"/>
+    <w:lsdException w:name="Table Classic 2" w:semiHidden="1" w:unhideWhenUsed="1"/>
+    <w:lsdException w:name="Table Classic 3" w:semiHidden="1" w:unhideWhenUsed="1"/>
+    <w:lsdException w:name="Table Classic 4" w:semiHidden="1" w:unhideWhenUsed="1"/>
+    <w:lsdException w:name="Table Colorful 1" w:semiHidden="1" w:unhideWhenUsed="1"/>
+    <w:lsdException w:name="Table Colorful 2" w:semiHidden="1" w:unhideWhenUsed="1"/>
+    <w:lsdException w:name="Table Colorful 3" w:semiHidden="1" w:unhideWhenUsed="1"/>
+    <w:lsdException w:name="Table Columns 1" w:semiHidden="1" w:unhideWhenUsed="1"/>
+    <w:lsdException w:name="Table Columns 2" w:semiHidden="1" w:unhideWhenUsed="1"/>
+    <w:lsdException w:name="Table Columns 3" w:semiHidden="1" w:unhideWhenUsed="1"/>
+    <w:lsdException w:name="Table Columns 4" w:semiHidden="1" w:unhideWhenUsed="1"/>
+    <w:lsdException w:name="Table Columns 5" w:semiHidden="1" w:unhideWhenUsed="1"/>
+    <w:lsdException w:name="Table Grid 1" w:semiHidden="1" w:unhideWhenUsed="1"/>
+    <w:lsdException w:name="Table Grid 2" w:semiHidden="1" w:unhideWhenUsed="1"/>
+    <w:lsdException w:name="Table Grid 3" w:semiHidden="1" w:unhideWhenUsed="1"/>
+    <w:lsdException w:name="Table Grid 4" w:semiHidden="1" w:unhideWhenUsed="1"/>
+    <w:lsdException w:name="Table Grid 5" w:semiHidden="1" w:unhideWhenUsed="1"/>
+    <w:lsdException w:name="Table Grid 6" w:semiHidden="1" w:unhideWhenUsed="1"/>
+    <w:lsdException w:name="Table Grid 7" w:semiHidden="1" w:unhideWhenUsed="1"/>
+    <w:lsdException w:name="Table Grid 8" w:semiHidden="1" w:unhideWhenUsed="1"/>
+    <w:lsdException w:name="Table List 1" w:semiHidden="1" w:unhideWhenUsed="1"/>
+    <w:lsdException w:name="Table List 2" w:semiHidden="1" w:unhideWhenUsed="1"/>
+    <w:lsdException w:name="Table List 3" w:semiHidden="1" w:unhideWhenUsed="1"/>
+    <w:lsdException w:name="Table List 4" w:semiHidden="1" w:unhideWhenUsed="1"/>
+    <w:lsdException w:name="Table List 5" w:semiHidden="1" w:unhideWhenUsed="1"/>
+    <w:lsdException w:name="Table List 6" w:semiHidden="1" w:unhideWhenUsed="1"/>
+    <w:lsdException w:name="Table List 7" w:semiHidden="1" w:unhideWhenUsed="1"/>
+    <w:lsdException w:name="Table List 8" w:semiHidden="1" w:unhideWhenUsed="1"/>
+    <w:lsdException w:name="Table 3D effects 1" w:semiHidden="1" w:unhideWhenUsed="1"/>
+    <w:lsdException w:name="Table 3D effects 2" w:semiHidden="1" w:unhideWhenUsed="1"/>
+    <w:lsdException w:name="Table 3D effects 3" w:semiHidden="1" w:unhideWhenUsed="1"/>
+    <w:lsdException w:name="Table Contemporary" w:semiHidden="1" w:unhideWhenUsed="1"/>
+    <w:lsdException w:name="Table Elegant" w:semiHidden="1" w:unhideWhenUsed="1"/>
+    <w:lsdException w:name="Table Professional" w:semiHidden="1" w:unhideWhenUsed="1"/>
+    <w:lsdException w:name="Table Subtle 1" w:semiHidden="1" w:unhideWhenUsed="1"/>
+    <w:lsdException w:name="Table Subtle 2" w:semiHidden="1" w:unhideWhenUsed="1"/>
+    <w:lsdException w:name="Table Web 1" w:semiHidden="1" w:unhideWhenUsed="1"/>
+    <w:lsdException w:name="Table Web 2" w:semiHidden="1" w:unhideWhenUsed="1"/>
+    <w:lsdException w:name="Table Web 3" w:semiHidden="1" w:unhideWhenUsed="1"/>
+    <w:lsdException w:name="Table Theme" w:semiHidden="1" w:unhideWhenUsed="1"/>
     <w:lsdException w:name="Placeholder Text" w:semiHidden="1" w:uiPriority="99"/>
     <w:lsdException w:name="No Spacing" w:uiPriority="1" w:qFormat="1"/>
     <w:lsdException w:name="Light Shading" w:uiPriority="60"/>
@@ -1874,11 +2287,15 @@
   </w:style>
   <w:style w:type="character" w:default="1" w:styleId="a0">
     <w:name w:val="Default Paragraph Font"/>
+    <w:uiPriority w:val="1"/>
     <w:semiHidden/>
+    <w:unhideWhenUsed/>
   </w:style>
   <w:style w:type="table" w:default="1" w:styleId="a1">
     <w:name w:val="Normal Table"/>
+    <w:uiPriority w:val="99"/>
     <w:semiHidden/>
+    <w:unhideWhenUsed/>
     <w:tblPr>
       <w:tblInd w:w="0" w:type="dxa"/>
       <w:tblCellMar>
@@ -1891,9 +2308,11 @@
   </w:style>
   <w:style w:type="numbering" w:default="1" w:styleId="a2">
     <w:name w:val="No List"/>
+    <w:uiPriority w:val="99"/>
     <w:semiHidden/>
+    <w:unhideWhenUsed/>
   </w:style>
-  <w:style w:type="paragraph" w:styleId="a3">
+  <w:style w:type="paragraph" w:customStyle="1" w:styleId="a3">
     <w:name w:val="Название"/>
     <w:basedOn w:val="a"/>
     <w:qFormat/>

</xml_diff>